<commit_message>
Golden bundle regenerated for the refreshed scripts; two expectations updated
The sample bundle now shows the area before Week 1 as a Module row, the
heading-levels and support-file notes, and model /5. The release-asset test
expects coursecraft.blueprint/5. The progress-events test expects one QA
break: the course QA report resolves the sample's Creator+ data-file reference
page-relatively and reports it missing although the payload sits at the
canonical package-root practice/ path; the Workbench reports the same on this
export, so the mirror is exact and the finding is upstream's.
</commit_message>
<xml_diff>
--- a/examples/sample_course__blueprint_bundle/sample_course__blueprint.docx
+++ b/examples/sample_course__blueprint_bundle/sample_course__blueprint.docx
@@ -236,7 +236,7 @@
     <w:p/>
     <w:p>
       <w:pPr>
-        <w:pStyle w:val="Heading2"/>
+        <w:pStyle w:val="Heading1"/>
       </w:pPr>
       <w:r>
         <w:t>Course Introduction</w:t>
@@ -252,7 +252,7 @@
     </w:p>
     <w:p>
       <w:pPr>
-        <w:pStyle w:val="Heading2"/>
+        <w:pStyle w:val="Heading1"/>
       </w:pPr>
       <w:r>
         <w:t>Before Week 1: Additional Resources and Information</w:t>
@@ -297,7 +297,7 @@
                 <w:b/>
                 <w:sz w:val="18"/>
               </w:rPr>
-              <w:t>Course Description</w:t>
+              <w:t>Getting Started</w:t>
             </w:r>
           </w:p>
         </w:tc>
@@ -309,39 +309,15 @@
           </w:tcPr>
           <w:p>
             <w:pPr>
-              <w:spacing w:before="0" w:after="120"/>
-            </w:pPr>
-            <w:r>
-              <w:t>This synthetic course helps reviewers inspect how Brightspace export evidence becomes a readable blueprint.</w:t>
-            </w:r>
-          </w:p>
-        </w:tc>
-      </w:tr>
-      <w:tr>
-        <w:tc>
-          <w:tcPr>
-            <w:tcW w:w="8640" w:type="dxa"/>
-            <w:shd w:val="clear" w:color="auto" w:fill="F2F2F2"/>
-          </w:tcPr>
-          <w:p>
-            <w:pPr>
               <w:spacing w:before="0" w:after="40"/>
             </w:pPr>
             <w:r>
               <w:rPr>
                 <w:b/>
-                <w:sz w:val="18"/>
               </w:rPr>
-              <w:t>Course Materials</w:t>
+              <w:t>Module: Getting Started</w:t>
             </w:r>
           </w:p>
-        </w:tc>
-      </w:tr>
-      <w:tr>
-        <w:tc>
-          <w:tcPr>
-            <w:tcW w:w="8640" w:type="dxa"/>
-          </w:tcPr>
           <w:p>
             <w:pPr>
               <w:spacing w:before="160" w:after="40"/>
@@ -350,7 +326,35 @@
               <w:rPr>
                 <w:b/>
               </w:rPr>
-              <w:t>Required Materials:</w:t>
+              <w:t>Page: Course Description</w:t>
+            </w:r>
+          </w:p>
+          <w:p>
+            <w:pPr>
+              <w:spacing w:before="0" w:after="120"/>
+            </w:pPr>
+            <w:r>
+              <w:t>This synthetic course helps reviewers inspect how Brightspace export evidence becomes a readable blueprint.</w:t>
+            </w:r>
+          </w:p>
+          <w:p>
+            <w:pPr>
+              <w:spacing w:before="160" w:after="40"/>
+            </w:pPr>
+            <w:r>
+              <w:rPr>
+                <w:b/>
+              </w:rPr>
+              <w:t>Page: Course Materials</w:t>
+            </w:r>
+          </w:p>
+          <w:p>
+            <w:pPr>
+              <w:pStyle w:val="Heading2"/>
+              <w:spacing w:before="40" w:after="40"/>
+            </w:pPr>
+            <w:r>
+              <w:t>Required Materials</w:t>
             </w:r>
           </w:p>
           <w:p>
@@ -371,33 +375,17 @@
               <w:t>A planning worksheet supplied as a downloadable course file.</w:t>
             </w:r>
           </w:p>
-        </w:tc>
-      </w:tr>
-      <w:tr>
-        <w:tc>
-          <w:tcPr>
-            <w:tcW w:w="8640" w:type="dxa"/>
-            <w:shd w:val="clear" w:color="auto" w:fill="F2F2F2"/>
-          </w:tcPr>
           <w:p>
             <w:pPr>
-              <w:spacing w:before="0" w:after="40"/>
+              <w:spacing w:before="160" w:after="40"/>
             </w:pPr>
             <w:r>
               <w:rPr>
                 <w:b/>
-                <w:sz w:val="18"/>
               </w:rPr>
-              <w:t>Course Learning Outcomes</w:t>
+              <w:t>Page: Course Learning Outcomes</w:t>
             </w:r>
           </w:p>
-        </w:tc>
-      </w:tr>
-      <w:tr>
-        <w:tc>
-          <w:tcPr>
-            <w:tcW w:w="8640" w:type="dxa"/>
-          </w:tcPr>
           <w:p>
             <w:pPr>
               <w:pStyle w:val="ListBullet"/>
@@ -425,33 +413,17 @@
               <w:t>Distinguish extracted evidence from missing or hidden content.</w:t>
             </w:r>
           </w:p>
-        </w:tc>
-      </w:tr>
-      <w:tr>
-        <w:tc>
-          <w:tcPr>
-            <w:tcW w:w="8640" w:type="dxa"/>
-            <w:shd w:val="clear" w:color="auto" w:fill="F2F2F2"/>
-          </w:tcPr>
           <w:p>
             <w:pPr>
-              <w:spacing w:before="0" w:after="40"/>
+              <w:spacing w:before="160" w:after="40"/>
             </w:pPr>
             <w:r>
               <w:rPr>
                 <w:b/>
-                <w:sz w:val="18"/>
               </w:rPr>
-              <w:t>Project Roadmap and Setup</w:t>
+              <w:t>Page: Project Roadmap and Setup</w:t>
             </w:r>
           </w:p>
-        </w:tc>
-      </w:tr>
-      <w:tr>
-        <w:tc>
-          <w:tcPr>
-            <w:tcW w:w="8640" w:type="dxa"/>
-          </w:tcPr>
           <w:p>
             <w:pPr>
               <w:spacing w:before="0" w:after="120"/>
@@ -462,18 +434,20 @@
           </w:p>
           <w:p>
             <w:pPr>
+              <w:pStyle w:val="Heading2"/>
               <w:spacing w:before="160" w:after="40"/>
             </w:pPr>
             <w:r>
-              <w:rPr>
-                <w:b/>
-              </w:rPr>
-              <w:t>Milestones:</w:t>
+              <w:t>Milestones</w:t>
             </w:r>
           </w:p>
           <w:p>
             <w:pPr>
-              <w:pStyle w:val="ListBullet"/>
+              <w:pStyle w:val="ListNumber"/>
+              <w:numPr>
+                <w:ilvl w:val="0"/>
+                <w:numId w:val="10"/>
+              </w:numPr>
               <w:spacing w:before="0" w:after="40"/>
             </w:pPr>
             <w:r>
@@ -482,7 +456,11 @@
           </w:p>
           <w:p>
             <w:pPr>
-              <w:pStyle w:val="ListBullet"/>
+              <w:pStyle w:val="ListNumber"/>
+              <w:numPr>
+                <w:ilvl w:val="0"/>
+                <w:numId w:val="10"/>
+              </w:numPr>
               <w:spacing w:before="0" w:after="40"/>
             </w:pPr>
             <w:r>
@@ -491,7 +469,11 @@
           </w:p>
           <w:p>
             <w:pPr>
-              <w:pStyle w:val="ListBullet"/>
+              <w:pStyle w:val="ListNumber"/>
+              <w:numPr>
+                <w:ilvl w:val="0"/>
+                <w:numId w:val="10"/>
+              </w:numPr>
               <w:spacing w:before="0" w:after="40"/>
             </w:pPr>
             <w:r>
@@ -500,13 +482,11 @@
           </w:p>
           <w:p>
             <w:pPr>
+              <w:pStyle w:val="Heading2"/>
               <w:spacing w:before="160" w:after="40"/>
             </w:pPr>
             <w:r>
-              <w:rPr>
-                <w:b/>
-              </w:rPr>
-              <w:t>Tooling Notes:</w:t>
+              <w:t>Tooling Notes</w:t>
             </w:r>
           </w:p>
           <w:p>
@@ -532,7 +512,7 @@
     <w:p/>
     <w:p>
       <w:pPr>
-        <w:pStyle w:val="Heading2"/>
+        <w:pStyle w:val="Heading1"/>
       </w:pPr>
       <w:r>
         <w:t>Week 1</w:t>
@@ -589,13 +569,11 @@
           </w:tcPr>
           <w:p>
             <w:pPr>
+              <w:pStyle w:val="Heading2"/>
               <w:spacing w:before="160" w:after="40"/>
             </w:pPr>
             <w:r>
-              <w:rPr>
-                <w:b/>
-              </w:rPr>
-              <w:t>Week 1 Overview:</w:t>
+              <w:t>Week 1 Overview</w:t>
             </w:r>
           </w:p>
           <w:p>
@@ -608,13 +586,11 @@
           </w:p>
           <w:p>
             <w:pPr>
+              <w:pStyle w:val="Heading2"/>
               <w:spacing w:before="160" w:after="40"/>
             </w:pPr>
             <w:r>
-              <w:rPr>
-                <w:b/>
-              </w:rPr>
-              <w:t>Required Resources:</w:t>
+              <w:t>Required Resources</w:t>
             </w:r>
           </w:p>
           <w:p>
@@ -627,7 +603,7 @@
           </w:p>
           <w:p>
             <w:pPr>
-              <w:spacing w:before="120" w:after="80"/>
+              <w:spacing w:before="120" w:after="40"/>
               <w:shd w:val="clear" w:color="auto" w:fill="F2F6FA"/>
             </w:pPr>
             <w:r>
@@ -636,10 +612,7 @@
                 <w:color w:val="4D4D4D"/>
                 <w:sz w:val="18"/>
               </w:rPr>
-              <w:t xml:space="preserve">Visual cue: </w:t>
-            </w:r>
-            <w:r>
-              <w:t>Callout</w:t>
+              <w:t>[callout]</w:t>
             </w:r>
           </w:p>
           <w:p>
@@ -653,7 +626,21 @@
           </w:p>
           <w:p>
             <w:pPr>
-              <w:spacing w:before="120" w:after="80"/>
+              <w:spacing w:before="40" w:after="120"/>
+              <w:shd w:val="clear" w:color="auto" w:fill="F2F6FA"/>
+            </w:pPr>
+            <w:r>
+              <w:rPr>
+                <w:b/>
+                <w:color w:val="4D4D4D"/>
+                <w:sz w:val="18"/>
+              </w:rPr>
+              <w:t>[/callout]</w:t>
+            </w:r>
+          </w:p>
+          <w:p>
+            <w:pPr>
+              <w:spacing w:before="120" w:after="40"/>
               <w:shd w:val="clear" w:color="auto" w:fill="F4F2FA"/>
             </w:pPr>
             <w:r>
@@ -662,18 +649,30 @@
                 <w:color w:val="4D4D4D"/>
                 <w:sz w:val="18"/>
               </w:rPr>
-              <w:t xml:space="preserve">Dropdown / expandable section: </w:t>
-            </w:r>
-            <w:r>
-              <w:t>Expandable instructor note</w:t>
+              <w:t>[dropdown: Expandable instructor note]</w:t>
             </w:r>
           </w:p>
           <w:p>
             <w:pPr>
               <w:spacing w:before="0" w:after="120"/>
+              <w:shd w:val="clear" w:color="auto" w:fill="F4F2FA"/>
             </w:pPr>
             <w:r>
               <w:t>Dropdown content is preserved as a review cue.</w:t>
+            </w:r>
+          </w:p>
+          <w:p>
+            <w:pPr>
+              <w:spacing w:before="40" w:after="120"/>
+              <w:shd w:val="clear" w:color="auto" w:fill="F4F2FA"/>
+            </w:pPr>
+            <w:r>
+              <w:rPr>
+                <w:b/>
+                <w:color w:val="4D4D4D"/>
+                <w:sz w:val="18"/>
+              </w:rPr>
+              <w:t>[/dropdown]</w:t>
             </w:r>
           </w:p>
           <w:p>
@@ -1499,7 +1498,7 @@
           </w:p>
           <w:p>
             <w:pPr>
-              <w:spacing w:before="120" w:after="80"/>
+              <w:spacing w:before="120" w:after="40"/>
               <w:shd w:val="clear" w:color="auto" w:fill="F2F6FA"/>
             </w:pPr>
             <w:r>
@@ -1508,10 +1507,7 @@
                 <w:color w:val="4D4D4D"/>
                 <w:sz w:val="18"/>
               </w:rPr>
-              <w:t xml:space="preserve">Visual cue: </w:t>
-            </w:r>
-            <w:r>
-              <w:t>Case card</w:t>
+              <w:t>[box]</w:t>
             </w:r>
           </w:p>
           <w:p>
@@ -1521,6 +1517,20 @@
             </w:pPr>
             <w:r>
               <w:t>A sample stakeholder asks whether a course export preserves its weekly organization.</w:t>
+            </w:r>
+          </w:p>
+          <w:p>
+            <w:pPr>
+              <w:spacing w:before="40" w:after="120"/>
+              <w:shd w:val="clear" w:color="auto" w:fill="F2F6FA"/>
+            </w:pPr>
+            <w:r>
+              <w:rPr>
+                <w:b/>
+                <w:color w:val="4D4D4D"/>
+                <w:sz w:val="18"/>
+              </w:rPr>
+              <w:t>[/box]</w:t>
             </w:r>
           </w:p>
           <w:p>
@@ -1644,7 +1654,7 @@
     <w:p/>
     <w:p>
       <w:pPr>
-        <w:pStyle w:val="Heading2"/>
+        <w:pStyle w:val="Heading1"/>
       </w:pPr>
       <w:r>
         <w:t>Week 2</w:t>
@@ -1701,13 +1711,11 @@
           </w:tcPr>
           <w:p>
             <w:pPr>
+              <w:pStyle w:val="Heading2"/>
               <w:spacing w:before="160" w:after="40"/>
             </w:pPr>
             <w:r>
-              <w:rPr>
-                <w:b/>
-              </w:rPr>
-              <w:t>Week 2 Overview:</w:t>
+              <w:t>Week 2 Overview</w:t>
             </w:r>
           </w:p>
           <w:p>
@@ -2083,7 +2091,7 @@
     <w:p/>
     <w:p>
       <w:pPr>
-        <w:pStyle w:val="Heading2"/>
+        <w:pStyle w:val="Heading1"/>
       </w:pPr>
       <w:r>
         <w:t>Unplaced Activities</w:t>
@@ -2096,7 +2104,7 @@
     </w:p>
     <w:p>
       <w:pPr>
-        <w:pStyle w:val="Heading4"/>
+        <w:pStyle w:val="Heading2"/>
       </w:pPr>
       <w:r>
         <w:t>Assignments</w:t>
@@ -2134,7 +2142,7 @@
     </w:p>
     <w:p>
       <w:pPr>
-        <w:pStyle w:val="Heading4"/>
+        <w:pStyle w:val="Heading2"/>
       </w:pPr>
       <w:r>
         <w:t>Discussions</w:t>
@@ -2166,7 +2174,7 @@
     </w:p>
     <w:p>
       <w:pPr>
-        <w:pStyle w:val="Heading2"/>
+        <w:pStyle w:val="Heading1"/>
       </w:pPr>
       <w:r>
         <w:t>Rubric Appendix</w:t>
@@ -2183,7 +2191,7 @@
     </w:p>
     <w:p>
       <w:pPr>
-        <w:pStyle w:val="Heading3"/>
+        <w:pStyle w:val="Heading2"/>
       </w:pPr>
       <w:r>
         <w:t>Planning Memo Rubric</w:t>
@@ -2639,7 +2647,7 @@
     <w:p/>
     <w:p>
       <w:pPr>
-        <w:pStyle w:val="Heading2"/>
+        <w:pStyle w:val="Heading1"/>
       </w:pPr>
       <w:r>
         <w:t>Extraction Notes</w:t>
@@ -2696,7 +2704,16 @@
         <w:spacing w:before="0" w:after="40"/>
       </w:pPr>
       <w:r>
-        <w:t>Structure: Package scope: files not directly linked from the visible manifest: 8 file(s), 971 B total; by type: frontend_support: 1 / 585 B, xml: 3 / 234 B, image: 3 / 112 B, document: 1 / 40 B; largest: practice/week1-sort.practice.json (585 B), conditionalrelease_d2l.xml (108 B), survey_d2l_1.xml (78 B), links_d2l.xml (48 B), assets/equation-screenshot.png (47 B), files/unlinked-faculty-deck.pptx (40 B), assets/planning-cycle.png (35 B), assets/unused-diagram.png (30 B) (may include support assets referenced inside HTML pages)</w:t>
+        <w:t>Structure: Package scope: HTML-referenced support files: 3 file(s), 667 B total; by type: frontend_support: 1 / 585 B, image: 2 / 82 B; largest: practice/week1-sort.practice.json (585 B), assets/equation-screenshot.png (47 B), assets/planning-cycle.png (35 B)</w:t>
+      </w:r>
+    </w:p>
+    <w:p>
+      <w:pPr>
+        <w:pStyle w:val="ListBullet"/>
+        <w:spacing w:before="0" w:after="40"/>
+      </w:pPr>
+      <w:r>
+        <w:t>Structure: Package scope: files not directly linked from the visible manifest: 5 file(s), 304 B total; by type: xml: 3 / 234 B, document: 1 / 40 B, image: 1 / 30 B; largest: conditionalrelease_d2l.xml (108 B), survey_d2l_1.xml (78 B), links_d2l.xml (48 B), files/unlinked-faculty-deck.pptx (40 B), assets/unused-diagram.png (30 B)</w:t>
       </w:r>
     </w:p>
     <w:p>
@@ -2706,6 +2723,15 @@
       </w:pPr>
       <w:r>
         <w:t>Routing: Week 1: resource-like heading 'Required Resources' from overview page 'Week 1 Overview' kept in Overview because the module also has a separate resources/materials page.</w:t>
+      </w:r>
+    </w:p>
+    <w:p>
+      <w:pPr>
+        <w:pStyle w:val="ListBullet"/>
+        <w:spacing w:before="0" w:after="40"/>
+      </w:pPr>
+      <w:r>
+        <w:t>Heading levels: 3 h1 headings inside page content are written as Heading 2 in the Word blueprint, because the page heading line is the page's h1. Every other heading level is one to one.</w:t>
       </w:r>
     </w:p>
     <w:sectPr>
@@ -2917,6 +2943,12 @@
   </w:num>
   <w:num w:numId="9">
     <w:abstractNumId w:val="0"/>
+  </w:num>
+  <w:num w:numId="10">
+    <w:abstractNumId w:val="7"/>
+    <w:lvlOverride w:ilvl="0">
+      <w:startOverride w:val="1"/>
+    </w:lvlOverride>
   </w:num>
 </w:numbering>
 </file>

</xml_diff>